<commit_message>
DAY 10 ALMOST DONE
</commit_message>
<xml_diff>
--- a/Received/1/1, hrhg.docx
+++ b/Received/1/1, hrhg.docx
@@ -67,6 +67,15 @@
                               </w:rPr>
                               <w:t>D-</w:t>
                             </w:r>
+                            <w:r>
+                              <w:rPr>
+                                <w:rFonts w:ascii="Times New Roman" w:eastAsia="Times New Roman" w:hAnsi="Times New Roman" w:cs="Times New Roman"/>
+                                <w:b/>
+                                <w:color w:val="000000"/>
+                                <w:sz w:val="32"/>
+                              </w:rPr>
+                              <w:t>10</w:t>
+                            </w:r>
                           </w:p>
                         </w:txbxContent>
                       </wps:txbx>
@@ -103,6 +112,15 @@
                           <w:sz w:val="32"/>
                         </w:rPr>
                         <w:t>D-</w:t>
+                      </w:r>
+                      <w:r>
+                        <w:rPr>
+                          <w:rFonts w:ascii="Times New Roman" w:eastAsia="Times New Roman" w:hAnsi="Times New Roman" w:cs="Times New Roman"/>
+                          <w:b/>
+                          <w:color w:val="000000"/>
+                          <w:sz w:val="32"/>
+                        </w:rPr>
+                        <w:t>10</w:t>
                       </w:r>
                     </w:p>
                   </w:txbxContent>
@@ -248,29 +266,7 @@
           <w:sz w:val="24"/>
           <w:szCs w:val="24"/>
         </w:rPr>
-        <w:t xml:space="preserve">Ratnanagar-7, </w:t>
-      </w:r>
-      <w:proofErr w:type="spellStart"/>
-      <w:r>
-        <w:rPr>
-          <w:rFonts w:ascii="Times New Roman" w:eastAsia="Times New Roman" w:hAnsi="Times New Roman" w:cs="Times New Roman"/>
-          <w:b/>
-          <w:bCs/>
-          <w:sz w:val="24"/>
-          <w:szCs w:val="24"/>
-        </w:rPr>
-        <w:t>Sauraha</w:t>
-      </w:r>
-      <w:proofErr w:type="spellEnd"/>
-      <w:r>
-        <w:rPr>
-          <w:rFonts w:ascii="Times New Roman" w:eastAsia="Times New Roman" w:hAnsi="Times New Roman" w:cs="Times New Roman"/>
-          <w:b/>
-          <w:bCs/>
-          <w:sz w:val="24"/>
-          <w:szCs w:val="24"/>
-        </w:rPr>
-        <w:t>, Chitwan</w:t>
+        <w:t>Ratnanagar-7, Sauraha, Chitwan</w:t>
       </w:r>
     </w:p>
     <w:p>
@@ -895,23 +891,13 @@
         </w:rPr>
         <w:tab/>
       </w:r>
-      <w:proofErr w:type="gramStart"/>
-      <w:r>
-        <w:rPr>
-          <w:rFonts w:ascii="Times New Roman" w:hAnsi="Times New Roman" w:cs="Times New Roman"/>
-          <w:sz w:val="28"/>
-          <w:szCs w:val="28"/>
-        </w:rPr>
-        <w:t>To</w:t>
-      </w:r>
-      <w:proofErr w:type="gramEnd"/>
-      <w:r>
-        <w:rPr>
-          <w:rFonts w:ascii="Times New Roman" w:hAnsi="Times New Roman" w:cs="Times New Roman"/>
-          <w:sz w:val="28"/>
-          <w:szCs w:val="28"/>
-        </w:rPr>
-        <w:t xml:space="preserve"> video call</w:t>
+      <w:r>
+        <w:rPr>
+          <w:rFonts w:ascii="Times New Roman" w:hAnsi="Times New Roman" w:cs="Times New Roman"/>
+          <w:sz w:val="28"/>
+          <w:szCs w:val="28"/>
+        </w:rPr>
+        <w:t>To video call</w:t>
       </w:r>
     </w:p>
     <w:p>
@@ -1115,23 +1101,13 @@
         </w:rPr>
         <w:tab/>
       </w:r>
-      <w:proofErr w:type="gramStart"/>
-      <w:r>
-        <w:rPr>
-          <w:rFonts w:ascii="Times New Roman" w:hAnsi="Times New Roman" w:cs="Times New Roman"/>
-          <w:sz w:val="28"/>
-          <w:szCs w:val="28"/>
-        </w:rPr>
-        <w:t>Red</w:t>
-      </w:r>
-      <w:proofErr w:type="gramEnd"/>
-      <w:r>
-        <w:rPr>
-          <w:rFonts w:ascii="Times New Roman" w:hAnsi="Times New Roman" w:cs="Times New Roman"/>
-          <w:sz w:val="28"/>
-          <w:szCs w:val="28"/>
-        </w:rPr>
-        <w:t xml:space="preserve"> light</w:t>
+      <w:r>
+        <w:rPr>
+          <w:rFonts w:ascii="Times New Roman" w:hAnsi="Times New Roman" w:cs="Times New Roman"/>
+          <w:sz w:val="28"/>
+          <w:szCs w:val="28"/>
+        </w:rPr>
+        <w:t>Red light</w:t>
       </w:r>
     </w:p>
     <w:p>
@@ -2062,59 +2038,13 @@
           <w:szCs w:val="28"/>
         </w:rPr>
       </w:pPr>
-      <w:proofErr w:type="spellStart"/>
-      <w:r>
-        <w:rPr>
-          <w:rFonts w:ascii="Times New Roman" w:hAnsi="Times New Roman" w:cs="Times New Roman"/>
-          <w:sz w:val="28"/>
-          <w:szCs w:val="28"/>
-        </w:rPr>
-        <w:t>Pokh</w:t>
-      </w:r>
-      <w:proofErr w:type="spellEnd"/>
-      <w:r>
-        <w:rPr>
-          <w:rFonts w:ascii="Times New Roman" w:hAnsi="Times New Roman" w:cs="Times New Roman"/>
-          <w:sz w:val="28"/>
-          <w:szCs w:val="28"/>
-        </w:rPr>
-        <w:t>_____</w:t>
-      </w:r>
-      <w:proofErr w:type="spellStart"/>
-      <w:r>
-        <w:rPr>
-          <w:rFonts w:ascii="Times New Roman" w:hAnsi="Times New Roman" w:cs="Times New Roman"/>
-          <w:sz w:val="28"/>
-          <w:szCs w:val="28"/>
-        </w:rPr>
-        <w:t>ra</w:t>
-      </w:r>
-      <w:proofErr w:type="spellEnd"/>
-      <w:r>
-        <w:rPr>
-          <w:rFonts w:ascii="Times New Roman" w:hAnsi="Times New Roman" w:cs="Times New Roman"/>
-          <w:sz w:val="28"/>
-          <w:szCs w:val="28"/>
-        </w:rPr>
-        <w:t xml:space="preserve">                           </w:t>
-      </w:r>
-      <w:proofErr w:type="spellStart"/>
-      <w:r>
-        <w:rPr>
-          <w:rFonts w:ascii="Times New Roman" w:hAnsi="Times New Roman" w:cs="Times New Roman"/>
-          <w:sz w:val="28"/>
-          <w:szCs w:val="28"/>
-        </w:rPr>
-        <w:t>Broth____r</w:t>
-      </w:r>
-      <w:proofErr w:type="spellEnd"/>
-      <w:r>
-        <w:rPr>
-          <w:rFonts w:ascii="Times New Roman" w:hAnsi="Times New Roman" w:cs="Times New Roman"/>
-          <w:sz w:val="28"/>
-          <w:szCs w:val="28"/>
-        </w:rPr>
-        <w:t xml:space="preserve">                    Garli_____</w:t>
+      <w:r>
+        <w:rPr>
+          <w:rFonts w:ascii="Times New Roman" w:hAnsi="Times New Roman" w:cs="Times New Roman"/>
+          <w:sz w:val="28"/>
+          <w:szCs w:val="28"/>
+        </w:rPr>
+        <w:t>Pokh_____ra                           Broth____r                    Garli_____</w:t>
       </w:r>
     </w:p>
     <w:p>
@@ -2142,34 +2072,14 @@
         </w:rPr>
         <w:tab/>
       </w:r>
-      <w:proofErr w:type="spellStart"/>
-      <w:r>
-        <w:rPr>
-          <w:rFonts w:ascii="Times New Roman" w:hAnsi="Times New Roman" w:cs="Times New Roman"/>
-          <w:sz w:val="28"/>
-          <w:szCs w:val="28"/>
-        </w:rPr>
-        <w:t>Pee____al</w:t>
-      </w:r>
-      <w:proofErr w:type="spellEnd"/>
-      <w:r>
-        <w:rPr>
-          <w:rFonts w:ascii="Times New Roman" w:hAnsi="Times New Roman" w:cs="Times New Roman"/>
-          <w:sz w:val="28"/>
-          <w:szCs w:val="28"/>
-        </w:rPr>
-        <w:t xml:space="preserve">                       </w:t>
-      </w:r>
-      <w:proofErr w:type="spellStart"/>
-      <w:r>
-        <w:rPr>
-          <w:rFonts w:ascii="Times New Roman" w:hAnsi="Times New Roman" w:cs="Times New Roman"/>
-          <w:sz w:val="28"/>
-          <w:szCs w:val="28"/>
-        </w:rPr>
-        <w:t>Ja___mine</w:t>
-      </w:r>
-      <w:proofErr w:type="spellEnd"/>
+      <w:r>
+        <w:rPr>
+          <w:rFonts w:ascii="Times New Roman" w:hAnsi="Times New Roman" w:cs="Times New Roman"/>
+          <w:sz w:val="28"/>
+          <w:szCs w:val="28"/>
+        </w:rPr>
+        <w:t>Pee____al                       Ja___mine</w:t>
+      </w:r>
     </w:p>
     <w:p>
       <w:pPr>
@@ -2317,41 +2227,13 @@
           <w:szCs w:val="28"/>
         </w:rPr>
       </w:pPr>
-      <w:proofErr w:type="gramStart"/>
-      <w:r>
-        <w:rPr>
-          <w:rFonts w:ascii="Times New Roman" w:hAnsi="Times New Roman" w:cs="Times New Roman"/>
-          <w:sz w:val="28"/>
-          <w:szCs w:val="28"/>
-        </w:rPr>
-        <w:t>Herbs :</w:t>
-      </w:r>
-      <w:proofErr w:type="gramEnd"/>
-      <w:r>
-        <w:rPr>
-          <w:rFonts w:ascii="Times New Roman" w:hAnsi="Times New Roman" w:cs="Times New Roman"/>
-          <w:sz w:val="28"/>
-          <w:szCs w:val="28"/>
-        </w:rPr>
-        <w:t>- _____________________</w:t>
-      </w:r>
-      <w:proofErr w:type="gramStart"/>
-      <w:r>
-        <w:rPr>
-          <w:rFonts w:ascii="Times New Roman" w:hAnsi="Times New Roman" w:cs="Times New Roman"/>
-          <w:sz w:val="28"/>
-          <w:szCs w:val="28"/>
-        </w:rPr>
-        <w:t>_ ,</w:t>
-      </w:r>
-      <w:proofErr w:type="gramEnd"/>
-      <w:r>
-        <w:rPr>
-          <w:rFonts w:ascii="Times New Roman" w:hAnsi="Times New Roman" w:cs="Times New Roman"/>
-          <w:sz w:val="28"/>
-          <w:szCs w:val="28"/>
-        </w:rPr>
-        <w:t xml:space="preserve">   _____________________.</w:t>
+      <w:r>
+        <w:rPr>
+          <w:rFonts w:ascii="Times New Roman" w:hAnsi="Times New Roman" w:cs="Times New Roman"/>
+          <w:sz w:val="28"/>
+          <w:szCs w:val="28"/>
+        </w:rPr>
+        <w:t>Herbs :- ______________________ ,   _____________________.</w:t>
       </w:r>
     </w:p>
     <w:p>
@@ -2368,41 +2250,13 @@
           <w:szCs w:val="28"/>
         </w:rPr>
       </w:pPr>
-      <w:proofErr w:type="gramStart"/>
-      <w:r>
-        <w:rPr>
-          <w:rFonts w:ascii="Times New Roman" w:hAnsi="Times New Roman" w:cs="Times New Roman"/>
-          <w:sz w:val="28"/>
-          <w:szCs w:val="28"/>
-        </w:rPr>
-        <w:t>Birds :</w:t>
-      </w:r>
-      <w:proofErr w:type="gramEnd"/>
-      <w:r>
-        <w:rPr>
-          <w:rFonts w:ascii="Times New Roman" w:hAnsi="Times New Roman" w:cs="Times New Roman"/>
-          <w:sz w:val="28"/>
-          <w:szCs w:val="28"/>
-        </w:rPr>
-        <w:t>- ______________________</w:t>
-      </w:r>
-      <w:proofErr w:type="gramStart"/>
-      <w:r>
-        <w:rPr>
-          <w:rFonts w:ascii="Times New Roman" w:hAnsi="Times New Roman" w:cs="Times New Roman"/>
-          <w:sz w:val="28"/>
-          <w:szCs w:val="28"/>
-        </w:rPr>
-        <w:t>_,  _</w:t>
-      </w:r>
-      <w:proofErr w:type="gramEnd"/>
-      <w:r>
-        <w:rPr>
-          <w:rFonts w:ascii="Times New Roman" w:hAnsi="Times New Roman" w:cs="Times New Roman"/>
-          <w:sz w:val="28"/>
-          <w:szCs w:val="28"/>
-        </w:rPr>
-        <w:t>____________________.</w:t>
+      <w:r>
+        <w:rPr>
+          <w:rFonts w:ascii="Times New Roman" w:hAnsi="Times New Roman" w:cs="Times New Roman"/>
+          <w:sz w:val="28"/>
+          <w:szCs w:val="28"/>
+        </w:rPr>
+        <w:t>Birds :- _______________________,  _____________________.</w:t>
       </w:r>
     </w:p>
     <w:p>
@@ -2425,43 +2279,7 @@
           <w:sz w:val="28"/>
           <w:szCs w:val="28"/>
         </w:rPr>
-        <w:t xml:space="preserve">Wild </w:t>
-      </w:r>
-      <w:proofErr w:type="gramStart"/>
-      <w:r>
-        <w:rPr>
-          <w:rFonts w:ascii="Times New Roman" w:hAnsi="Times New Roman" w:cs="Times New Roman"/>
-          <w:sz w:val="28"/>
-          <w:szCs w:val="28"/>
-        </w:rPr>
-        <w:t>animals :</w:t>
-      </w:r>
-      <w:proofErr w:type="gramEnd"/>
-      <w:r>
-        <w:rPr>
-          <w:rFonts w:ascii="Times New Roman" w:hAnsi="Times New Roman" w:cs="Times New Roman"/>
-          <w:sz w:val="28"/>
-          <w:szCs w:val="28"/>
-        </w:rPr>
-        <w:t>- ________________</w:t>
-      </w:r>
-      <w:proofErr w:type="gramStart"/>
-      <w:r>
-        <w:rPr>
-          <w:rFonts w:ascii="Times New Roman" w:hAnsi="Times New Roman" w:cs="Times New Roman"/>
-          <w:sz w:val="28"/>
-          <w:szCs w:val="28"/>
-        </w:rPr>
-        <w:t>_,  _</w:t>
-      </w:r>
-      <w:proofErr w:type="gramEnd"/>
-      <w:r>
-        <w:rPr>
-          <w:rFonts w:ascii="Times New Roman" w:hAnsi="Times New Roman" w:cs="Times New Roman"/>
-          <w:sz w:val="28"/>
-          <w:szCs w:val="28"/>
-        </w:rPr>
-        <w:t>____________________.</w:t>
+        <w:t>Wild animals :- _________________,  _____________________.</w:t>
       </w:r>
     </w:p>
     <w:p>
@@ -2606,7 +2424,6 @@
           <w:szCs w:val="28"/>
         </w:rPr>
       </w:pPr>
-      <w:proofErr w:type="gramStart"/>
       <w:r>
         <w:rPr>
           <w:rFonts w:ascii="Times New Roman" w:hAnsi="Times New Roman" w:cs="Times New Roman"/>
@@ -2615,7 +2432,6 @@
         </w:rPr>
         <w:t>Ans:-</w:t>
       </w:r>
-      <w:proofErr w:type="gramEnd"/>
       <w:r>
         <w:rPr>
           <w:rFonts w:ascii="Times New Roman" w:hAnsi="Times New Roman" w:cs="Times New Roman"/>
@@ -2687,7 +2503,6 @@
           <w:szCs w:val="28"/>
         </w:rPr>
       </w:pPr>
-      <w:proofErr w:type="gramStart"/>
       <w:r>
         <w:rPr>
           <w:rFonts w:ascii="Times New Roman" w:hAnsi="Times New Roman" w:cs="Times New Roman"/>
@@ -2696,7 +2511,6 @@
         </w:rPr>
         <w:t>Ans:-</w:t>
       </w:r>
-      <w:proofErr w:type="gramEnd"/>
       <w:r>
         <w:rPr>
           <w:rFonts w:ascii="Times New Roman" w:hAnsi="Times New Roman" w:cs="Times New Roman"/>
@@ -2760,7 +2574,6 @@
           <w:szCs w:val="28"/>
         </w:rPr>
       </w:pPr>
-      <w:proofErr w:type="gramStart"/>
       <w:r>
         <w:rPr>
           <w:rFonts w:ascii="Times New Roman" w:hAnsi="Times New Roman" w:cs="Times New Roman"/>
@@ -2769,7 +2582,6 @@
         </w:rPr>
         <w:t>Ans:-</w:t>
       </w:r>
-      <w:proofErr w:type="gramEnd"/>
       <w:r>
         <w:rPr>
           <w:rFonts w:ascii="Times New Roman" w:hAnsi="Times New Roman" w:cs="Times New Roman"/>
@@ -2897,7 +2709,7 @@
           <w:noProof/>
         </w:rPr>
         <w:drawing>
-          <wp:anchor distT="0" distB="0" distL="114300" distR="114300" simplePos="0" relativeHeight="251663360" behindDoc="0" locked="0" layoutInCell="1" allowOverlap="1" wp14:anchorId="736289B2" wp14:editId="61EA196D">
+          <wp:anchor distT="0" distB="0" distL="114300" distR="114300" simplePos="0" relativeHeight="251663360" behindDoc="0" locked="0" layoutInCell="1" allowOverlap="1" wp14:anchorId="736289B2" wp14:editId="2300A258">
             <wp:simplePos x="0" y="0"/>
             <wp:positionH relativeFrom="column">
               <wp:posOffset>4991100</wp:posOffset>
@@ -4355,6 +4167,7 @@
   <w:style w:type="character" w:default="1" w:styleId="DefaultParagraphFont">
     <w:name w:val="Default Paragraph Font"/>
     <w:uiPriority w:val="1"/>
+    <w:semiHidden/>
     <w:unhideWhenUsed/>
   </w:style>
   <w:style w:type="table" w:default="1" w:styleId="TableNormal">

</xml_diff>

<commit_message>
Day 12 almost done
</commit_message>
<xml_diff>
--- a/Received/1/1, hrhg.docx
+++ b/Received/1/1, hrhg.docx
@@ -266,7 +266,29 @@
           <w:sz w:val="24"/>
           <w:szCs w:val="24"/>
         </w:rPr>
-        <w:t>Ratnanagar-7, Sauraha, Chitwan</w:t>
+        <w:t>Ratnanagar-</w:t>
+      </w:r>
+      <w:proofErr w:type="gramStart"/>
+      <w:r>
+        <w:rPr>
+          <w:rFonts w:ascii="Times New Roman" w:eastAsia="Times New Roman" w:hAnsi="Times New Roman" w:cs="Times New Roman"/>
+          <w:b/>
+          <w:bCs/>
+          <w:sz w:val="24"/>
+          <w:szCs w:val="24"/>
+        </w:rPr>
+        <w:t>7,Sauraha</w:t>
+      </w:r>
+      <w:proofErr w:type="gramEnd"/>
+      <w:r>
+        <w:rPr>
+          <w:rFonts w:ascii="Times New Roman" w:eastAsia="Times New Roman" w:hAnsi="Times New Roman" w:cs="Times New Roman"/>
+          <w:b/>
+          <w:bCs/>
+          <w:sz w:val="24"/>
+          <w:szCs w:val="24"/>
+        </w:rPr>
+        <w:t>, Chitwan</w:t>
       </w:r>
     </w:p>
     <w:p>
@@ -891,13 +913,23 @@
         </w:rPr>
         <w:tab/>
       </w:r>
-      <w:r>
-        <w:rPr>
-          <w:rFonts w:ascii="Times New Roman" w:hAnsi="Times New Roman" w:cs="Times New Roman"/>
-          <w:sz w:val="28"/>
-          <w:szCs w:val="28"/>
-        </w:rPr>
-        <w:t>To video call</w:t>
+      <w:proofErr w:type="gramStart"/>
+      <w:r>
+        <w:rPr>
+          <w:rFonts w:ascii="Times New Roman" w:hAnsi="Times New Roman" w:cs="Times New Roman"/>
+          <w:sz w:val="28"/>
+          <w:szCs w:val="28"/>
+        </w:rPr>
+        <w:t>To</w:t>
+      </w:r>
+      <w:proofErr w:type="gramEnd"/>
+      <w:r>
+        <w:rPr>
+          <w:rFonts w:ascii="Times New Roman" w:hAnsi="Times New Roman" w:cs="Times New Roman"/>
+          <w:sz w:val="28"/>
+          <w:szCs w:val="28"/>
+        </w:rPr>
+        <w:t xml:space="preserve"> video call</w:t>
       </w:r>
     </w:p>
     <w:p>
@@ -1101,13 +1133,23 @@
         </w:rPr>
         <w:tab/>
       </w:r>
-      <w:r>
-        <w:rPr>
-          <w:rFonts w:ascii="Times New Roman" w:hAnsi="Times New Roman" w:cs="Times New Roman"/>
-          <w:sz w:val="28"/>
-          <w:szCs w:val="28"/>
-        </w:rPr>
-        <w:t>Red light</w:t>
+      <w:proofErr w:type="gramStart"/>
+      <w:r>
+        <w:rPr>
+          <w:rFonts w:ascii="Times New Roman" w:hAnsi="Times New Roman" w:cs="Times New Roman"/>
+          <w:sz w:val="28"/>
+          <w:szCs w:val="28"/>
+        </w:rPr>
+        <w:t>Red</w:t>
+      </w:r>
+      <w:proofErr w:type="gramEnd"/>
+      <w:r>
+        <w:rPr>
+          <w:rFonts w:ascii="Times New Roman" w:hAnsi="Times New Roman" w:cs="Times New Roman"/>
+          <w:sz w:val="28"/>
+          <w:szCs w:val="28"/>
+        </w:rPr>
+        <w:t xml:space="preserve"> light</w:t>
       </w:r>
     </w:p>
     <w:p>
@@ -2038,13 +2080,59 @@
           <w:szCs w:val="28"/>
         </w:rPr>
       </w:pPr>
-      <w:r>
-        <w:rPr>
-          <w:rFonts w:ascii="Times New Roman" w:hAnsi="Times New Roman" w:cs="Times New Roman"/>
-          <w:sz w:val="28"/>
-          <w:szCs w:val="28"/>
-        </w:rPr>
-        <w:t>Pokh_____ra                           Broth____r                    Garli_____</w:t>
+      <w:proofErr w:type="spellStart"/>
+      <w:r>
+        <w:rPr>
+          <w:rFonts w:ascii="Times New Roman" w:hAnsi="Times New Roman" w:cs="Times New Roman"/>
+          <w:sz w:val="28"/>
+          <w:szCs w:val="28"/>
+        </w:rPr>
+        <w:t>Pokh</w:t>
+      </w:r>
+      <w:proofErr w:type="spellEnd"/>
+      <w:r>
+        <w:rPr>
+          <w:rFonts w:ascii="Times New Roman" w:hAnsi="Times New Roman" w:cs="Times New Roman"/>
+          <w:sz w:val="28"/>
+          <w:szCs w:val="28"/>
+        </w:rPr>
+        <w:t>_____</w:t>
+      </w:r>
+      <w:proofErr w:type="spellStart"/>
+      <w:r>
+        <w:rPr>
+          <w:rFonts w:ascii="Times New Roman" w:hAnsi="Times New Roman" w:cs="Times New Roman"/>
+          <w:sz w:val="28"/>
+          <w:szCs w:val="28"/>
+        </w:rPr>
+        <w:t>ra</w:t>
+      </w:r>
+      <w:proofErr w:type="spellEnd"/>
+      <w:r>
+        <w:rPr>
+          <w:rFonts w:ascii="Times New Roman" w:hAnsi="Times New Roman" w:cs="Times New Roman"/>
+          <w:sz w:val="28"/>
+          <w:szCs w:val="28"/>
+        </w:rPr>
+        <w:t xml:space="preserve">                           </w:t>
+      </w:r>
+      <w:proofErr w:type="spellStart"/>
+      <w:r>
+        <w:rPr>
+          <w:rFonts w:ascii="Times New Roman" w:hAnsi="Times New Roman" w:cs="Times New Roman"/>
+          <w:sz w:val="28"/>
+          <w:szCs w:val="28"/>
+        </w:rPr>
+        <w:t>Broth____r</w:t>
+      </w:r>
+      <w:proofErr w:type="spellEnd"/>
+      <w:r>
+        <w:rPr>
+          <w:rFonts w:ascii="Times New Roman" w:hAnsi="Times New Roman" w:cs="Times New Roman"/>
+          <w:sz w:val="28"/>
+          <w:szCs w:val="28"/>
+        </w:rPr>
+        <w:t xml:space="preserve">                    Garli_____</w:t>
       </w:r>
     </w:p>
     <w:p>
@@ -2072,14 +2160,34 @@
         </w:rPr>
         <w:tab/>
       </w:r>
-      <w:r>
-        <w:rPr>
-          <w:rFonts w:ascii="Times New Roman" w:hAnsi="Times New Roman" w:cs="Times New Roman"/>
-          <w:sz w:val="28"/>
-          <w:szCs w:val="28"/>
-        </w:rPr>
-        <w:t>Pee____al                       Ja___mine</w:t>
-      </w:r>
+      <w:proofErr w:type="spellStart"/>
+      <w:r>
+        <w:rPr>
+          <w:rFonts w:ascii="Times New Roman" w:hAnsi="Times New Roman" w:cs="Times New Roman"/>
+          <w:sz w:val="28"/>
+          <w:szCs w:val="28"/>
+        </w:rPr>
+        <w:t>Pee____al</w:t>
+      </w:r>
+      <w:proofErr w:type="spellEnd"/>
+      <w:r>
+        <w:rPr>
+          <w:rFonts w:ascii="Times New Roman" w:hAnsi="Times New Roman" w:cs="Times New Roman"/>
+          <w:sz w:val="28"/>
+          <w:szCs w:val="28"/>
+        </w:rPr>
+        <w:t xml:space="preserve">                       </w:t>
+      </w:r>
+      <w:proofErr w:type="spellStart"/>
+      <w:r>
+        <w:rPr>
+          <w:rFonts w:ascii="Times New Roman" w:hAnsi="Times New Roman" w:cs="Times New Roman"/>
+          <w:sz w:val="28"/>
+          <w:szCs w:val="28"/>
+        </w:rPr>
+        <w:t>Ja___mine</w:t>
+      </w:r>
+      <w:proofErr w:type="spellEnd"/>
     </w:p>
     <w:p>
       <w:pPr>
@@ -2227,13 +2335,41 @@
           <w:szCs w:val="28"/>
         </w:rPr>
       </w:pPr>
-      <w:r>
-        <w:rPr>
-          <w:rFonts w:ascii="Times New Roman" w:hAnsi="Times New Roman" w:cs="Times New Roman"/>
-          <w:sz w:val="28"/>
-          <w:szCs w:val="28"/>
-        </w:rPr>
-        <w:t>Herbs :- ______________________ ,   _____________________.</w:t>
+      <w:proofErr w:type="gramStart"/>
+      <w:r>
+        <w:rPr>
+          <w:rFonts w:ascii="Times New Roman" w:hAnsi="Times New Roman" w:cs="Times New Roman"/>
+          <w:sz w:val="28"/>
+          <w:szCs w:val="28"/>
+        </w:rPr>
+        <w:t>Herbs :</w:t>
+      </w:r>
+      <w:proofErr w:type="gramEnd"/>
+      <w:r>
+        <w:rPr>
+          <w:rFonts w:ascii="Times New Roman" w:hAnsi="Times New Roman" w:cs="Times New Roman"/>
+          <w:sz w:val="28"/>
+          <w:szCs w:val="28"/>
+        </w:rPr>
+        <w:t>- _____________________</w:t>
+      </w:r>
+      <w:proofErr w:type="gramStart"/>
+      <w:r>
+        <w:rPr>
+          <w:rFonts w:ascii="Times New Roman" w:hAnsi="Times New Roman" w:cs="Times New Roman"/>
+          <w:sz w:val="28"/>
+          <w:szCs w:val="28"/>
+        </w:rPr>
+        <w:t>_ ,</w:t>
+      </w:r>
+      <w:proofErr w:type="gramEnd"/>
+      <w:r>
+        <w:rPr>
+          <w:rFonts w:ascii="Times New Roman" w:hAnsi="Times New Roman" w:cs="Times New Roman"/>
+          <w:sz w:val="28"/>
+          <w:szCs w:val="28"/>
+        </w:rPr>
+        <w:t xml:space="preserve">   _____________________.</w:t>
       </w:r>
     </w:p>
     <w:p>
@@ -2250,13 +2386,41 @@
           <w:szCs w:val="28"/>
         </w:rPr>
       </w:pPr>
-      <w:r>
-        <w:rPr>
-          <w:rFonts w:ascii="Times New Roman" w:hAnsi="Times New Roman" w:cs="Times New Roman"/>
-          <w:sz w:val="28"/>
-          <w:szCs w:val="28"/>
-        </w:rPr>
-        <w:t>Birds :- _______________________,  _____________________.</w:t>
+      <w:proofErr w:type="gramStart"/>
+      <w:r>
+        <w:rPr>
+          <w:rFonts w:ascii="Times New Roman" w:hAnsi="Times New Roman" w:cs="Times New Roman"/>
+          <w:sz w:val="28"/>
+          <w:szCs w:val="28"/>
+        </w:rPr>
+        <w:t>Birds :</w:t>
+      </w:r>
+      <w:proofErr w:type="gramEnd"/>
+      <w:r>
+        <w:rPr>
+          <w:rFonts w:ascii="Times New Roman" w:hAnsi="Times New Roman" w:cs="Times New Roman"/>
+          <w:sz w:val="28"/>
+          <w:szCs w:val="28"/>
+        </w:rPr>
+        <w:t>- ______________________</w:t>
+      </w:r>
+      <w:proofErr w:type="gramStart"/>
+      <w:r>
+        <w:rPr>
+          <w:rFonts w:ascii="Times New Roman" w:hAnsi="Times New Roman" w:cs="Times New Roman"/>
+          <w:sz w:val="28"/>
+          <w:szCs w:val="28"/>
+        </w:rPr>
+        <w:t>_,  _</w:t>
+      </w:r>
+      <w:proofErr w:type="gramEnd"/>
+      <w:r>
+        <w:rPr>
+          <w:rFonts w:ascii="Times New Roman" w:hAnsi="Times New Roman" w:cs="Times New Roman"/>
+          <w:sz w:val="28"/>
+          <w:szCs w:val="28"/>
+        </w:rPr>
+        <w:t>____________________.</w:t>
       </w:r>
     </w:p>
     <w:p>
@@ -2279,7 +2443,43 @@
           <w:sz w:val="28"/>
           <w:szCs w:val="28"/>
         </w:rPr>
-        <w:t>Wild animals :- _________________,  _____________________.</w:t>
+        <w:t xml:space="preserve">Wild </w:t>
+      </w:r>
+      <w:proofErr w:type="gramStart"/>
+      <w:r>
+        <w:rPr>
+          <w:rFonts w:ascii="Times New Roman" w:hAnsi="Times New Roman" w:cs="Times New Roman"/>
+          <w:sz w:val="28"/>
+          <w:szCs w:val="28"/>
+        </w:rPr>
+        <w:t>animals :</w:t>
+      </w:r>
+      <w:proofErr w:type="gramEnd"/>
+      <w:r>
+        <w:rPr>
+          <w:rFonts w:ascii="Times New Roman" w:hAnsi="Times New Roman" w:cs="Times New Roman"/>
+          <w:sz w:val="28"/>
+          <w:szCs w:val="28"/>
+        </w:rPr>
+        <w:t>- ________________</w:t>
+      </w:r>
+      <w:proofErr w:type="gramStart"/>
+      <w:r>
+        <w:rPr>
+          <w:rFonts w:ascii="Times New Roman" w:hAnsi="Times New Roman" w:cs="Times New Roman"/>
+          <w:sz w:val="28"/>
+          <w:szCs w:val="28"/>
+        </w:rPr>
+        <w:t>_,  _</w:t>
+      </w:r>
+      <w:proofErr w:type="gramEnd"/>
+      <w:r>
+        <w:rPr>
+          <w:rFonts w:ascii="Times New Roman" w:hAnsi="Times New Roman" w:cs="Times New Roman"/>
+          <w:sz w:val="28"/>
+          <w:szCs w:val="28"/>
+        </w:rPr>
+        <w:t>____________________.</w:t>
       </w:r>
     </w:p>
     <w:p>
@@ -2424,6 +2624,7 @@
           <w:szCs w:val="28"/>
         </w:rPr>
       </w:pPr>
+      <w:proofErr w:type="gramStart"/>
       <w:r>
         <w:rPr>
           <w:rFonts w:ascii="Times New Roman" w:hAnsi="Times New Roman" w:cs="Times New Roman"/>
@@ -2432,6 +2633,7 @@
         </w:rPr>
         <w:t>Ans:-</w:t>
       </w:r>
+      <w:proofErr w:type="gramEnd"/>
       <w:r>
         <w:rPr>
           <w:rFonts w:ascii="Times New Roman" w:hAnsi="Times New Roman" w:cs="Times New Roman"/>
@@ -2503,6 +2705,7 @@
           <w:szCs w:val="28"/>
         </w:rPr>
       </w:pPr>
+      <w:proofErr w:type="gramStart"/>
       <w:r>
         <w:rPr>
           <w:rFonts w:ascii="Times New Roman" w:hAnsi="Times New Roman" w:cs="Times New Roman"/>
@@ -2511,6 +2714,7 @@
         </w:rPr>
         <w:t>Ans:-</w:t>
       </w:r>
+      <w:proofErr w:type="gramEnd"/>
       <w:r>
         <w:rPr>
           <w:rFonts w:ascii="Times New Roman" w:hAnsi="Times New Roman" w:cs="Times New Roman"/>
@@ -2574,6 +2778,7 @@
           <w:szCs w:val="28"/>
         </w:rPr>
       </w:pPr>
+      <w:proofErr w:type="gramStart"/>
       <w:r>
         <w:rPr>
           <w:rFonts w:ascii="Times New Roman" w:hAnsi="Times New Roman" w:cs="Times New Roman"/>
@@ -2582,6 +2787,7 @@
         </w:rPr>
         <w:t>Ans:-</w:t>
       </w:r>
+      <w:proofErr w:type="gramEnd"/>
       <w:r>
         <w:rPr>
           <w:rFonts w:ascii="Times New Roman" w:hAnsi="Times New Roman" w:cs="Times New Roman"/>
@@ -2709,7 +2915,7 @@
           <w:noProof/>
         </w:rPr>
         <w:drawing>
-          <wp:anchor distT="0" distB="0" distL="114300" distR="114300" simplePos="0" relativeHeight="251663360" behindDoc="0" locked="0" layoutInCell="1" allowOverlap="1" wp14:anchorId="736289B2" wp14:editId="2300A258">
+          <wp:anchor distT="0" distB="0" distL="114300" distR="114300" simplePos="0" relativeHeight="251663360" behindDoc="0" locked="0" layoutInCell="1" allowOverlap="1" wp14:anchorId="736289B2" wp14:editId="1FAC3BFA">
             <wp:simplePos x="0" y="0"/>
             <wp:positionH relativeFrom="column">
               <wp:posOffset>4991100</wp:posOffset>

</xml_diff>

<commit_message>
Day 10 questions sent for printing.
</commit_message>
<xml_diff>
--- a/Received/1/1, hrhg.docx
+++ b/Received/1/1, hrhg.docx
@@ -266,9 +266,8 @@
           <w:sz w:val="24"/>
           <w:szCs w:val="24"/>
         </w:rPr>
-        <w:t>Ratnanagar-</w:t>
-      </w:r>
-      <w:proofErr w:type="gramStart"/>
+        <w:t>Ratnanagar-7,</w:t>
+      </w:r>
       <w:r>
         <w:rPr>
           <w:rFonts w:ascii="Times New Roman" w:eastAsia="Times New Roman" w:hAnsi="Times New Roman" w:cs="Times New Roman"/>
@@ -277,9 +276,20 @@
           <w:sz w:val="24"/>
           <w:szCs w:val="24"/>
         </w:rPr>
-        <w:t>7,Sauraha</w:t>
-      </w:r>
-      <w:proofErr w:type="gramEnd"/>
+        <w:t xml:space="preserve"> </w:t>
+      </w:r>
+      <w:proofErr w:type="spellStart"/>
+      <w:r>
+        <w:rPr>
+          <w:rFonts w:ascii="Times New Roman" w:eastAsia="Times New Roman" w:hAnsi="Times New Roman" w:cs="Times New Roman"/>
+          <w:b/>
+          <w:bCs/>
+          <w:sz w:val="24"/>
+          <w:szCs w:val="24"/>
+        </w:rPr>
+        <w:t>Sauraha</w:t>
+      </w:r>
+      <w:proofErr w:type="spellEnd"/>
       <w:r>
         <w:rPr>
           <w:rFonts w:ascii="Times New Roman" w:eastAsia="Times New Roman" w:hAnsi="Times New Roman" w:cs="Times New Roman"/>
@@ -535,6 +545,16 @@
           <w:szCs w:val="28"/>
         </w:rPr>
         <w:t>Sub: HRHG</w:t>
+      </w:r>
+      <w:r>
+        <w:rPr>
+          <w:rFonts w:ascii="Times New Roman" w:eastAsia="Times New Roman" w:hAnsi="Times New Roman" w:cs="Times New Roman"/>
+          <w:b/>
+          <w:bCs/>
+          <w:sz w:val="28"/>
+          <w:szCs w:val="28"/>
+        </w:rPr>
+        <w:t xml:space="preserve"> (LC)</w:t>
       </w:r>
     </w:p>
     <w:tbl>
@@ -1013,7 +1033,7 @@
           <w:sz w:val="28"/>
           <w:szCs w:val="28"/>
         </w:rPr>
-        <w:t>Dashain</w:t>
+        <w:t>Good habit</w:t>
       </w:r>
     </w:p>
     <w:p>
@@ -1055,7 +1075,7 @@
           <w:sz w:val="28"/>
           <w:szCs w:val="28"/>
         </w:rPr>
-        <w:t>Domestic animal</w:t>
+        <w:t>Red light</w:t>
       </w:r>
     </w:p>
     <w:p>
@@ -1097,7 +1117,7 @@
           <w:sz w:val="28"/>
           <w:szCs w:val="28"/>
         </w:rPr>
-        <w:t>Good habit</w:t>
+        <w:t>Dashain</w:t>
       </w:r>
     </w:p>
     <w:p>
@@ -1133,23 +1153,13 @@
         </w:rPr>
         <w:tab/>
       </w:r>
-      <w:proofErr w:type="gramStart"/>
-      <w:r>
-        <w:rPr>
-          <w:rFonts w:ascii="Times New Roman" w:hAnsi="Times New Roman" w:cs="Times New Roman"/>
-          <w:sz w:val="28"/>
-          <w:szCs w:val="28"/>
-        </w:rPr>
-        <w:t>Red</w:t>
-      </w:r>
-      <w:proofErr w:type="gramEnd"/>
-      <w:r>
-        <w:rPr>
-          <w:rFonts w:ascii="Times New Roman" w:hAnsi="Times New Roman" w:cs="Times New Roman"/>
-          <w:sz w:val="28"/>
-          <w:szCs w:val="28"/>
-        </w:rPr>
-        <w:t xml:space="preserve"> light</w:t>
+      <w:r>
+        <w:rPr>
+          <w:rFonts w:ascii="Times New Roman" w:hAnsi="Times New Roman" w:cs="Times New Roman"/>
+          <w:sz w:val="28"/>
+          <w:szCs w:val="28"/>
+        </w:rPr>
+        <w:t>Domestic animal</w:t>
       </w:r>
     </w:p>
     <w:p>
@@ -1245,7 +1255,27 @@
           <w:sz w:val="28"/>
           <w:szCs w:val="28"/>
         </w:rPr>
-        <w:t>Q no.2] Write true or False.</w:t>
+        <w:t xml:space="preserve">Q no.2] Write true or </w:t>
+      </w:r>
+      <w:r>
+        <w:rPr>
+          <w:rFonts w:ascii="Times New Roman" w:hAnsi="Times New Roman" w:cs="Times New Roman"/>
+          <w:b/>
+          <w:bCs/>
+          <w:sz w:val="28"/>
+          <w:szCs w:val="28"/>
+        </w:rPr>
+        <w:t>f</w:t>
+      </w:r>
+      <w:r>
+        <w:rPr>
+          <w:rFonts w:ascii="Times New Roman" w:hAnsi="Times New Roman" w:cs="Times New Roman"/>
+          <w:b/>
+          <w:bCs/>
+          <w:sz w:val="28"/>
+          <w:szCs w:val="28"/>
+        </w:rPr>
+        <w:t>alse.</w:t>
       </w:r>
       <w:r>
         <w:rPr>
@@ -1702,7 +1732,7 @@
           <w:sz w:val="28"/>
           <w:szCs w:val="28"/>
         </w:rPr>
-        <w:t>Parrot is water animals</w:t>
+        <w:t>Parrot is water animal</w:t>
       </w:r>
       <w:r>
         <w:rPr>
@@ -2208,47 +2238,47 @@
           <w:sz w:val="28"/>
           <w:szCs w:val="28"/>
         </w:rPr>
-        <w:t>Q no.4] Write any names.</w:t>
-      </w:r>
-      <w:r>
-        <w:rPr>
-          <w:rFonts w:ascii="Times New Roman" w:hAnsi="Times New Roman" w:cs="Times New Roman"/>
-          <w:b/>
-          <w:bCs/>
-          <w:sz w:val="28"/>
-          <w:szCs w:val="28"/>
-        </w:rPr>
-        <w:tab/>
-      </w:r>
-      <w:r>
-        <w:rPr>
-          <w:rFonts w:ascii="Times New Roman" w:hAnsi="Times New Roman" w:cs="Times New Roman"/>
-          <w:b/>
-          <w:bCs/>
-          <w:sz w:val="28"/>
-          <w:szCs w:val="28"/>
-        </w:rPr>
-        <w:tab/>
-      </w:r>
-      <w:r>
-        <w:rPr>
-          <w:rFonts w:ascii="Times New Roman" w:hAnsi="Times New Roman" w:cs="Times New Roman"/>
-          <w:b/>
-          <w:bCs/>
-          <w:sz w:val="28"/>
-          <w:szCs w:val="28"/>
-        </w:rPr>
-        <w:tab/>
-      </w:r>
-      <w:r>
-        <w:rPr>
-          <w:rFonts w:ascii="Times New Roman" w:hAnsi="Times New Roman" w:cs="Times New Roman"/>
-          <w:b/>
-          <w:bCs/>
-          <w:sz w:val="28"/>
-          <w:szCs w:val="28"/>
-        </w:rPr>
-        <w:tab/>
+        <w:t>Q no.4] Write any</w:t>
+      </w:r>
+      <w:r>
+        <w:rPr>
+          <w:rFonts w:ascii="Times New Roman" w:hAnsi="Times New Roman" w:cs="Times New Roman"/>
+          <w:b/>
+          <w:bCs/>
+          <w:sz w:val="28"/>
+          <w:szCs w:val="28"/>
+        </w:rPr>
+        <w:t xml:space="preserve"> two</w:t>
+      </w:r>
+      <w:r>
+        <w:rPr>
+          <w:rFonts w:ascii="Times New Roman" w:hAnsi="Times New Roman" w:cs="Times New Roman"/>
+          <w:b/>
+          <w:bCs/>
+          <w:sz w:val="28"/>
+          <w:szCs w:val="28"/>
+        </w:rPr>
+        <w:t xml:space="preserve"> names</w:t>
+      </w:r>
+      <w:r>
+        <w:rPr>
+          <w:rFonts w:ascii="Times New Roman" w:hAnsi="Times New Roman" w:cs="Times New Roman"/>
+          <w:b/>
+          <w:bCs/>
+          <w:sz w:val="28"/>
+          <w:szCs w:val="28"/>
+        </w:rPr>
+        <w:t xml:space="preserve"> in each instruction</w:t>
+      </w:r>
+      <w:r>
+        <w:rPr>
+          <w:rFonts w:ascii="Times New Roman" w:hAnsi="Times New Roman" w:cs="Times New Roman"/>
+          <w:b/>
+          <w:bCs/>
+          <w:sz w:val="28"/>
+          <w:szCs w:val="28"/>
+        </w:rPr>
+        <w:t>.</w:t>
       </w:r>
       <w:r>
         <w:rPr>
@@ -2836,7 +2866,7 @@
           <w:noProof/>
         </w:rPr>
         <w:drawing>
-          <wp:anchor distT="0" distB="0" distL="114300" distR="114300" simplePos="0" relativeHeight="251662336" behindDoc="0" locked="0" layoutInCell="1" allowOverlap="1" wp14:anchorId="5339D252" wp14:editId="0A8CD171">
+          <wp:anchor distT="0" distB="0" distL="114300" distR="114300" simplePos="0" relativeHeight="251662336" behindDoc="0" locked="0" layoutInCell="1" allowOverlap="1" wp14:anchorId="5339D252" wp14:editId="7103B3A6">
             <wp:simplePos x="0" y="0"/>
             <wp:positionH relativeFrom="column">
               <wp:posOffset>2876550</wp:posOffset>
@@ -2915,7 +2945,7 @@
           <w:noProof/>
         </w:rPr>
         <w:drawing>
-          <wp:anchor distT="0" distB="0" distL="114300" distR="114300" simplePos="0" relativeHeight="251663360" behindDoc="0" locked="0" layoutInCell="1" allowOverlap="1" wp14:anchorId="736289B2" wp14:editId="1FAC3BFA">
+          <wp:anchor distT="0" distB="0" distL="114300" distR="114300" simplePos="0" relativeHeight="251663360" behindDoc="0" locked="0" layoutInCell="1" allowOverlap="1" wp14:anchorId="736289B2" wp14:editId="2D0EA85D">
             <wp:simplePos x="0" y="0"/>
             <wp:positionH relativeFrom="column">
               <wp:posOffset>4991100</wp:posOffset>
@@ -3203,7 +3233,7 @@
         <mc:AlternateContent>
           <mc:Choice Requires="wps">
             <w:drawing>
-              <wp:anchor distT="0" distB="0" distL="114300" distR="114300" simplePos="0" relativeHeight="251668480" behindDoc="0" locked="0" layoutInCell="1" allowOverlap="1" wp14:anchorId="71FCB13A" wp14:editId="16A10351">
+              <wp:anchor distT="0" distB="0" distL="114300" distR="114300" simplePos="0" relativeHeight="251668480" behindDoc="0" locked="0" layoutInCell="1" allowOverlap="1" wp14:anchorId="71FCB13A" wp14:editId="20908F79">
                 <wp:simplePos x="0" y="0"/>
                 <wp:positionH relativeFrom="column">
                   <wp:posOffset>4857750</wp:posOffset>
@@ -3268,7 +3298,7 @@
           </mc:Choice>
           <mc:Fallback>
             <w:pict>
-              <v:rect w14:anchorId="061E8765" id="Rectangle 9" o:spid="_x0000_s1026" style="position:absolute;margin-left:382.5pt;margin-top:21.05pt;width:166.5pt;height:39pt;z-index:251668480;visibility:visible;mso-wrap-style:square;mso-width-percent:0;mso-wrap-distance-left:9pt;mso-wrap-distance-top:0;mso-wrap-distance-right:9pt;mso-wrap-distance-bottom:0;mso-position-horizontal:absolute;mso-position-horizontal-relative:text;mso-position-vertical:absolute;mso-position-vertical-relative:text;mso-width-percent:0;mso-width-relative:margin;v-text-anchor:middle" o:gfxdata="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" filled="f" strokecolor="black [3213]" strokeweight="1pt"/>
+              <v:rect w14:anchorId="6252C8DE" id="Rectangle 9" o:spid="_x0000_s1026" style="position:absolute;margin-left:382.5pt;margin-top:21.05pt;width:166.5pt;height:39pt;z-index:251668480;visibility:visible;mso-wrap-style:square;mso-width-percent:0;mso-wrap-distance-left:9pt;mso-wrap-distance-top:0;mso-wrap-distance-right:9pt;mso-wrap-distance-bottom:0;mso-position-horizontal:absolute;mso-position-horizontal-relative:text;mso-position-vertical:absolute;mso-position-vertical-relative:text;mso-width-percent:0;mso-width-relative:margin;v-text-anchor:middle" o:gfxdata="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" filled="f" strokecolor="black [3213]" strokeweight="1pt"/>
             </w:pict>
           </mc:Fallback>
         </mc:AlternateContent>
@@ -3446,6 +3476,254 @@
     </w:p>
     <w:p>
       <w:pPr>
+        <w:rPr>
+          <w:rFonts w:ascii="Times New Roman" w:hAnsi="Times New Roman" w:cs="Times New Roman"/>
+          <w:b/>
+          <w:bCs/>
+          <w:sz w:val="28"/>
+          <w:szCs w:val="28"/>
+        </w:rPr>
+      </w:pPr>
+      <w:r>
+        <w:rPr>
+          <w:noProof/>
+        </w:rPr>
+        <w:drawing>
+          <wp:anchor distT="0" distB="0" distL="114300" distR="114300" simplePos="0" relativeHeight="251680768" behindDoc="0" locked="0" layoutInCell="1" allowOverlap="1" wp14:anchorId="72257C5E" wp14:editId="3372C506">
+            <wp:simplePos x="0" y="0"/>
+            <wp:positionH relativeFrom="column">
+              <wp:posOffset>-10884</wp:posOffset>
+            </wp:positionH>
+            <wp:positionV relativeFrom="paragraph">
+              <wp:posOffset>300473</wp:posOffset>
+            </wp:positionV>
+            <wp:extent cx="2397967" cy="1828800"/>
+            <wp:effectExtent l="0" t="0" r="2540" b="0"/>
+            <wp:wrapNone/>
+            <wp:docPr id="2021381939" name="Picture 13" descr="10,222 Cartoon Ant Black &amp; White Royalty-Free Images, Stock ..."/>
+            <wp:cNvGraphicFramePr>
+              <a:graphicFrameLocks xmlns:a="http://schemas.openxmlformats.org/drawingml/2006/main" noChangeAspect="1"/>
+            </wp:cNvGraphicFramePr>
+            <a:graphic xmlns:a="http://schemas.openxmlformats.org/drawingml/2006/main">
+              <a:graphicData uri="http://schemas.openxmlformats.org/drawingml/2006/picture">
+                <pic:pic xmlns:pic="http://schemas.openxmlformats.org/drawingml/2006/picture">
+                  <pic:nvPicPr>
+                    <pic:cNvPr id="0" name="Picture 1" descr="10,222 Cartoon Ant Black &amp; White Royalty-Free Images, Stock ..."/>
+                    <pic:cNvPicPr>
+                      <a:picLocks noChangeAspect="1" noChangeArrowheads="1"/>
+                    </pic:cNvPicPr>
+                  </pic:nvPicPr>
+                  <pic:blipFill rotWithShape="1">
+                    <a:blip r:embed="rId14">
+                      <a:extLst>
+                        <a:ext uri="{28A0092B-C50C-407E-A947-70E740481C1C}">
+                          <a14:useLocalDpi xmlns:a14="http://schemas.microsoft.com/office/drawing/2010/main" val="0"/>
+                        </a:ext>
+                      </a:extLst>
+                    </a:blip>
+                    <a:srcRect l="9008" t="17349" r="5249" b="17260"/>
+                    <a:stretch>
+                      <a:fillRect/>
+                    </a:stretch>
+                  </pic:blipFill>
+                  <pic:spPr bwMode="auto">
+                    <a:xfrm>
+                      <a:off x="0" y="0"/>
+                      <a:ext cx="2397967" cy="1828800"/>
+                    </a:xfrm>
+                    <a:prstGeom prst="rect">
+                      <a:avLst/>
+                    </a:prstGeom>
+                    <a:noFill/>
+                    <a:ln>
+                      <a:noFill/>
+                    </a:ln>
+                    <a:extLst>
+                      <a:ext uri="{53640926-AAD7-44D8-BBD7-CCE9431645EC}">
+                        <a14:shadowObscured xmlns:a14="http://schemas.microsoft.com/office/drawing/2010/main"/>
+                      </a:ext>
+                    </a:extLst>
+                  </pic:spPr>
+                </pic:pic>
+              </a:graphicData>
+            </a:graphic>
+            <wp14:sizeRelH relativeFrom="margin">
+              <wp14:pctWidth>0</wp14:pctWidth>
+            </wp14:sizeRelH>
+            <wp14:sizeRelV relativeFrom="margin">
+              <wp14:pctHeight>0</wp14:pctHeight>
+            </wp14:sizeRelV>
+          </wp:anchor>
+        </w:drawing>
+      </w:r>
+    </w:p>
+    <w:p>
+      <w:pPr>
+        <w:jc w:val="center"/>
+        <w:rPr>
+          <w:rFonts w:ascii="Times New Roman" w:hAnsi="Times New Roman" w:cs="Times New Roman"/>
+          <w:b/>
+          <w:bCs/>
+          <w:sz w:val="28"/>
+          <w:szCs w:val="28"/>
+        </w:rPr>
+      </w:pPr>
+    </w:p>
+    <w:p>
+      <w:pPr>
+        <w:jc w:val="center"/>
+        <w:rPr>
+          <w:rFonts w:ascii="Times New Roman" w:hAnsi="Times New Roman" w:cs="Times New Roman"/>
+          <w:b/>
+          <w:bCs/>
+          <w:sz w:val="28"/>
+          <w:szCs w:val="28"/>
+        </w:rPr>
+      </w:pPr>
+    </w:p>
+    <w:p>
+      <w:pPr>
+        <w:jc w:val="center"/>
+        <w:rPr>
+          <w:rFonts w:ascii="Times New Roman" w:hAnsi="Times New Roman" w:cs="Times New Roman"/>
+          <w:b/>
+          <w:bCs/>
+          <w:sz w:val="28"/>
+          <w:szCs w:val="28"/>
+        </w:rPr>
+      </w:pPr>
+    </w:p>
+    <w:p>
+      <w:pPr>
+        <w:jc w:val="center"/>
+        <w:rPr>
+          <w:rFonts w:ascii="Times New Roman" w:hAnsi="Times New Roman" w:cs="Times New Roman"/>
+          <w:b/>
+          <w:bCs/>
+          <w:sz w:val="28"/>
+          <w:szCs w:val="28"/>
+        </w:rPr>
+      </w:pPr>
+    </w:p>
+    <w:p>
+      <w:pPr>
+        <w:jc w:val="center"/>
+        <w:rPr>
+          <w:rFonts w:ascii="Times New Roman" w:hAnsi="Times New Roman" w:cs="Times New Roman"/>
+          <w:b/>
+          <w:bCs/>
+          <w:sz w:val="28"/>
+          <w:szCs w:val="28"/>
+        </w:rPr>
+      </w:pPr>
+    </w:p>
+    <w:p>
+      <w:pPr>
+        <w:jc w:val="center"/>
+        <w:rPr>
+          <w:rFonts w:ascii="Times New Roman" w:hAnsi="Times New Roman" w:cs="Times New Roman"/>
+          <w:b/>
+          <w:bCs/>
+          <w:sz w:val="28"/>
+          <w:szCs w:val="28"/>
+        </w:rPr>
+      </w:pPr>
+      <w:r>
+        <w:rPr>
+          <w:rFonts w:ascii="Times New Roman" w:hAnsi="Times New Roman" w:cs="Times New Roman"/>
+          <w:noProof/>
+          <w:sz w:val="28"/>
+          <w:szCs w:val="28"/>
+        </w:rPr>
+        <mc:AlternateContent>
+          <mc:Choice Requires="wps">
+            <w:drawing>
+              <wp:anchor distT="0" distB="0" distL="114300" distR="114300" simplePos="0" relativeHeight="251682816" behindDoc="0" locked="0" layoutInCell="1" allowOverlap="1" wp14:anchorId="4C01F7D2" wp14:editId="1E28FD81">
+                <wp:simplePos x="0" y="0"/>
+                <wp:positionH relativeFrom="column">
+                  <wp:posOffset>1905</wp:posOffset>
+                </wp:positionH>
+                <wp:positionV relativeFrom="paragraph">
+                  <wp:posOffset>76584</wp:posOffset>
+                </wp:positionV>
+                <wp:extent cx="2114550" cy="495300"/>
+                <wp:effectExtent l="0" t="0" r="19050" b="19050"/>
+                <wp:wrapNone/>
+                <wp:docPr id="598282339" name="Rectangle 9"/>
+                <wp:cNvGraphicFramePr/>
+                <a:graphic xmlns:a="http://schemas.openxmlformats.org/drawingml/2006/main">
+                  <a:graphicData uri="http://schemas.microsoft.com/office/word/2010/wordprocessingShape">
+                    <wps:wsp>
+                      <wps:cNvSpPr/>
+                      <wps:spPr>
+                        <a:xfrm>
+                          <a:off x="0" y="0"/>
+                          <a:ext cx="2114550" cy="495300"/>
+                        </a:xfrm>
+                        <a:prstGeom prst="rect">
+                          <a:avLst/>
+                        </a:prstGeom>
+                        <a:noFill/>
+                        <a:ln>
+                          <a:solidFill>
+                            <a:schemeClr val="tx1"/>
+                          </a:solidFill>
+                        </a:ln>
+                      </wps:spPr>
+                      <wps:style>
+                        <a:lnRef idx="2">
+                          <a:schemeClr val="accent1">
+                            <a:shade val="15000"/>
+                          </a:schemeClr>
+                        </a:lnRef>
+                        <a:fillRef idx="1">
+                          <a:schemeClr val="accent1"/>
+                        </a:fillRef>
+                        <a:effectRef idx="0">
+                          <a:schemeClr val="accent1"/>
+                        </a:effectRef>
+                        <a:fontRef idx="minor">
+                          <a:schemeClr val="lt1"/>
+                        </a:fontRef>
+                      </wps:style>
+                      <wps:bodyPr rot="0" spcFirstLastPara="0" vertOverflow="overflow" horzOverflow="overflow" vert="horz" wrap="square" lIns="91440" tIns="45720" rIns="91440" bIns="45720" numCol="1" spcCol="0" rtlCol="0" fromWordArt="0" anchor="ctr" anchorCtr="0" forceAA="0" compatLnSpc="1">
+                        <a:prstTxWarp prst="textNoShape">
+                          <a:avLst/>
+                        </a:prstTxWarp>
+                        <a:noAutofit/>
+                      </wps:bodyPr>
+                    </wps:wsp>
+                  </a:graphicData>
+                </a:graphic>
+                <wp14:sizeRelH relativeFrom="margin">
+                  <wp14:pctWidth>0</wp14:pctWidth>
+                </wp14:sizeRelH>
+              </wp:anchor>
+            </w:drawing>
+          </mc:Choice>
+          <mc:Fallback>
+            <w:pict>
+              <v:rect w14:anchorId="7C670524" id="Rectangle 9" o:spid="_x0000_s1026" style="position:absolute;margin-left:.15pt;margin-top:6.05pt;width:166.5pt;height:39pt;z-index:251682816;visibility:visible;mso-wrap-style:square;mso-width-percent:0;mso-wrap-distance-left:9pt;mso-wrap-distance-top:0;mso-wrap-distance-right:9pt;mso-wrap-distance-bottom:0;mso-position-horizontal:absolute;mso-position-horizontal-relative:text;mso-position-vertical:absolute;mso-position-vertical-relative:text;mso-width-percent:0;mso-width-relative:margin;v-text-anchor:middle" o:gfxdata="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" filled="f" strokecolor="black [3213]" strokeweight="1pt"/>
+            </w:pict>
+          </mc:Fallback>
+        </mc:AlternateContent>
+      </w:r>
+    </w:p>
+    <w:p>
+      <w:pPr>
+        <w:jc w:val="center"/>
+        <w:rPr>
+          <w:rFonts w:ascii="Times New Roman" w:hAnsi="Times New Roman" w:cs="Times New Roman"/>
+          <w:b/>
+          <w:bCs/>
+          <w:sz w:val="28"/>
+          <w:szCs w:val="28"/>
+        </w:rPr>
+      </w:pPr>
+    </w:p>
+    <w:p>
+      <w:pPr>
+        <w:jc w:val="center"/>
         <w:rPr>
           <w:rFonts w:ascii="Times New Roman" w:hAnsi="Times New Roman" w:cs="Times New Roman"/>
           <w:b/>

</xml_diff>